<commit_message>
Aprimora validacao e documentacao da entrega
</commit_message>
<xml_diff>
--- a/docs/Relatorio_Academico_Conecta_Plus.docx
+++ b/docs/Relatorio_Academico_Conecta_Plus.docx
@@ -2488,6 +2488,22 @@
         <w:pStyle w:val="ListBullet"/>
       </w:pPr>
       <w:r>
+        <w:t>npm run test: executa testes automatizados de API e frontend.</w:t>
+      </w:r>
+    </w:p>
+    <w:p>
+      <w:pPr>
+        <w:pStyle w:val="ListBullet"/>
+      </w:pPr>
+      <w:r>
+        <w:t>docker compose up --build -d: valida execucao integrada com PostgreSQL, API e frontend conteinerizados.</w:t>
+      </w:r>
+    </w:p>
+    <w:p>
+      <w:pPr>
+        <w:pStyle w:val="ListBullet"/>
+      </w:pPr>
+      <w:r>
         <w:rPr>
           <w:rFonts w:ascii="Calibri" w:hAnsi="Calibri"/>
           <w:b w:val="0"/>

</xml_diff>